<commit_message>
Created the Conceptual Solution Architech diagram and used in documentation
</commit_message>
<xml_diff>
--- a/docs/Solution-Architecture-Document-SAD.docx
+++ b/docs/Solution-Architecture-Document-SAD.docx
@@ -1,6 +1,6 @@
 
 <file path=word/document.xml><?xml version="1.0" encoding="utf-8"?>
-<w:document xmlns:wpc="http://schemas.microsoft.com/office/word/2010/wordprocessingCanvas" xmlns:cx="http://schemas.microsoft.com/office/drawing/2014/chartex" xmlns:cx1="http://schemas.microsoft.com/office/drawing/2015/9/8/chartex" xmlns:cx2="http://schemas.microsoft.com/office/drawing/2015/10/21/chartex" xmlns:cx3="http://schemas.microsoft.com/office/drawing/2016/5/9/chartex" xmlns:cx4="http://schemas.microsoft.com/office/drawing/2016/5/10/chartex" xmlns:cx5="http://schemas.microsoft.com/office/drawing/2016/5/11/chartex" xmlns:cx6="http://schemas.microsoft.com/office/drawing/2016/5/12/chartex" xmlns:cx7="http://schemas.microsoft.com/office/drawing/2016/5/13/chartex" xmlns:cx8="http://schemas.microsoft.com/office/drawing/2016/5/14/chartex" xmlns:mc="http://schemas.openxmlformats.org/markup-compatibility/2006" xmlns:aink="http://schemas.microsoft.com/office/drawing/2016/ink" xmlns:am3d="http://schemas.microsoft.com/office/drawing/2017/model3d" xmlns:o="urn:schemas-microsoft-com:office:office" xmlns:oel="http://schemas.microsoft.com/office/2019/extlst" xmlns:r="http://schemas.openxmlformats.org/officeDocument/2006/relationships" xmlns:m="http://schemas.openxmlformats.org/officeDocument/2006/math" xmlns:v="urn:schemas-microsoft-com:vml" xmlns:wp14="http://schemas.microsoft.com/office/word/2010/wordprocessingDrawing" xmlns:wp="http://schemas.openxmlformats.org/drawingml/2006/wordprocessingDrawing" xmlns:w10="urn:schemas-microsoft-com:office:word" xmlns:w="http://schemas.openxmlformats.org/wordprocessingml/2006/main" xmlns:w14="http://schemas.microsoft.com/office/word/2010/wordml" xmlns:w15="http://schemas.microsoft.com/office/word/2012/wordml" xmlns:w16cei="http://schemas.microsoft.com/office/word/2026/wordml/cei" xmlns:w16cex="http://schemas.microsoft.com/office/word/2018/wordml/cex" xmlns:w16cid="http://schemas.microsoft.com/office/word/2016/wordml/cid" xmlns:w16="http://schemas.microsoft.com/office/word/2018/wordml" xmlns:w16du="http://schemas.microsoft.com/office/word/2023/wordml/word16du" xmlns:w16sdtdh="http://schemas.microsoft.com/office/word/2020/wordml/sdtdatahash" xmlns:w16sdtfl="http://schemas.microsoft.com/office/word/2024/wordml/sdtformatlock" xmlns:w16se="http://schemas.microsoft.com/office/word/2015/wordml/symex" xmlns:wpg="http://schemas.microsoft.com/office/word/2010/wordprocessingGroup" xmlns:wpi="http://schemas.microsoft.com/office/word/2010/wordprocessingInk" xmlns:wne="http://schemas.microsoft.com/office/word/2006/wordml" xmlns:wps="http://schemas.microsoft.com/office/word/2010/wordprocessingShape" mc:Ignorable="w14 w15 w16se w16cid w16 w16cex w16sdtdh w16sdtfl w16du wp14">
+<w:document xmlns:wpc="http://schemas.microsoft.com/office/word/2010/wordprocessingCanvas" xmlns:cx="http://schemas.microsoft.com/office/drawing/2014/chartex" xmlns:cx1="http://schemas.microsoft.com/office/drawing/2015/9/8/chartex" xmlns:cx2="http://schemas.microsoft.com/office/drawing/2015/10/21/chartex" xmlns:cx3="http://schemas.microsoft.com/office/drawing/2016/5/9/chartex" xmlns:cx4="http://schemas.microsoft.com/office/drawing/2016/5/10/chartex" xmlns:cx5="http://schemas.microsoft.com/office/drawing/2016/5/11/chartex" xmlns:cx6="http://schemas.microsoft.com/office/drawing/2016/5/12/chartex" xmlns:cx7="http://schemas.microsoft.com/office/drawing/2016/5/13/chartex" xmlns:cx8="http://schemas.microsoft.com/office/drawing/2016/5/14/chartex" xmlns:mc="http://schemas.openxmlformats.org/markup-compatibility/2006" xmlns:aink="http://schemas.microsoft.com/office/drawing/2016/ink" xmlns:am3d="http://schemas.microsoft.com/office/drawing/2017/model3d" xmlns:o="urn:schemas-microsoft-com:office:office" xmlns:oel="http://schemas.microsoft.com/office/2019/extlst" xmlns:r="http://schemas.openxmlformats.org/officeDocument/2006/relationships" xmlns:m="http://schemas.openxmlformats.org/officeDocument/2006/math" xmlns:v="urn:schemas-microsoft-com:vml" xmlns:wp14="http://schemas.microsoft.com/office/word/2010/wordprocessingDrawing" xmlns:wp="http://schemas.openxmlformats.org/drawingml/2006/wordprocessingDrawing" xmlns:w10="urn:schemas-microsoft-com:office:word" xmlns:w="http://schemas.openxmlformats.org/wordprocessingml/2006/main" xmlns:w14="http://schemas.microsoft.com/office/word/2010/wordml" xmlns:w15="http://schemas.microsoft.com/office/word/2012/wordml" xmlns:w16cex="http://schemas.microsoft.com/office/word/2018/wordml/cex" xmlns:w16cid="http://schemas.microsoft.com/office/word/2016/wordml/cid" xmlns:w16="http://schemas.microsoft.com/office/word/2018/wordml" xmlns:w16du="http://schemas.microsoft.com/office/word/2023/wordml/word16du" xmlns:w16sdtdh="http://schemas.microsoft.com/office/word/2020/wordml/sdtdatahash" xmlns:w16sdtfl="http://schemas.microsoft.com/office/word/2024/wordml/sdtformatlock" xmlns:w16se="http://schemas.microsoft.com/office/word/2015/wordml/symex" xmlns:wpg="http://schemas.microsoft.com/office/word/2010/wordprocessingGroup" xmlns:wpi="http://schemas.microsoft.com/office/word/2010/wordprocessingInk" xmlns:wne="http://schemas.microsoft.com/office/word/2006/wordml" xmlns:wps="http://schemas.microsoft.com/office/word/2010/wordprocessingShape" mc:Ignorable="w14 w15 w16se w16cid w16 w16cex w16sdtdh w16sdtfl w16du wp14">
   <w:body>
     <w:p/>
     <w:p/>
@@ -4720,6 +4720,57 @@
       </w:r>
     </w:p>
     <w:p/>
+    <w:p/>
+    <w:p>
+      <w:r>
+        <w:rPr>
+          <w:noProof/>
+        </w:rPr>
+        <w:drawing>
+          <wp:inline distT="0" distB="0" distL="0" distR="0" wp14:anchorId="4CED1995" wp14:editId="2A34B0E2">
+            <wp:extent cx="6262480" cy="2863165"/>
+            <wp:effectExtent l="19050" t="19050" r="24130" b="13970"/>
+            <wp:docPr id="51476212" name="Picture 1"/>
+            <wp:cNvGraphicFramePr>
+              <a:graphicFrameLocks xmlns:a="http://schemas.openxmlformats.org/drawingml/2006/main" noChangeAspect="1"/>
+            </wp:cNvGraphicFramePr>
+            <a:graphic xmlns:a="http://schemas.openxmlformats.org/drawingml/2006/main">
+              <a:graphicData uri="http://schemas.openxmlformats.org/drawingml/2006/picture">
+                <pic:pic xmlns:pic="http://schemas.openxmlformats.org/drawingml/2006/picture">
+                  <pic:nvPicPr>
+                    <pic:cNvPr id="51476212" name="Picture 51476212"/>
+                    <pic:cNvPicPr/>
+                  </pic:nvPicPr>
+                  <pic:blipFill>
+                    <a:blip r:embed="rId11"/>
+                    <a:stretch>
+                      <a:fillRect/>
+                    </a:stretch>
+                  </pic:blipFill>
+                  <pic:spPr>
+                    <a:xfrm>
+                      <a:off x="0" y="0"/>
+                      <a:ext cx="6273108" cy="2868024"/>
+                    </a:xfrm>
+                    <a:prstGeom prst="rect">
+                      <a:avLst/>
+                    </a:prstGeom>
+                    <a:ln>
+                      <a:solidFill>
+                        <a:schemeClr val="tx1"/>
+                      </a:solidFill>
+                    </a:ln>
+                  </pic:spPr>
+                </pic:pic>
+              </a:graphicData>
+            </a:graphic>
+          </wp:inline>
+        </w:drawing>
+      </w:r>
+    </w:p>
+    <w:p/>
+    <w:p/>
+    <w:p/>
     <w:p>
       <w:pPr>
         <w:rPr>
@@ -4946,6 +4997,7 @@
     <w:p/>
     <w:p>
       <w:r>
+        <w:lastRenderedPageBreak/>
         <w:t>Compliance Management</w:t>
       </w:r>
     </w:p>
@@ -5253,7 +5305,6 @@
     <w:p/>
     <w:p>
       <w:r>
-        <w:lastRenderedPageBreak/>
         <w:t>Reporting and Notifications</w:t>
       </w:r>
     </w:p>
@@ -5650,6 +5701,7 @@
       </w:pPr>
       <w:bookmarkStart w:id="11" w:name="_Toc238602811"/>
       <w:r>
+        <w:lastRenderedPageBreak/>
         <w:t>Assumptions</w:t>
       </w:r>
       <w:bookmarkEnd w:id="11"/>
@@ -6202,7 +6254,6 @@
               <w:rPr>
                 <w:lang w:val="en-US"/>
               </w:rPr>
-              <w:lastRenderedPageBreak/>
               <w:t>C01</w:t>
             </w:r>
           </w:p>
@@ -6924,6 +6975,7 @@
               <w:rPr>
                 <w:lang w:val="en-US"/>
               </w:rPr>
+              <w:lastRenderedPageBreak/>
               <w:t>D07</w:t>
             </w:r>
           </w:p>
@@ -7323,7 +7375,6 @@
               <w:rPr>
                 <w:lang w:val="en-US"/>
               </w:rPr>
-              <w:lastRenderedPageBreak/>
               <w:t>AD04</w:t>
             </w:r>
           </w:p>
@@ -9234,7 +9285,7 @@
                     <pic:cNvPicPr/>
                   </pic:nvPicPr>
                   <pic:blipFill>
-                    <a:blip r:embed="rId11"/>
+                    <a:blip r:embed="rId12"/>
                     <a:stretch>
                       <a:fillRect/>
                     </a:stretch>
@@ -9370,7 +9421,7 @@
                     <pic:cNvPicPr/>
                   </pic:nvPicPr>
                   <pic:blipFill>
-                    <a:blip r:embed="rId12"/>
+                    <a:blip r:embed="rId13"/>
                     <a:stretch>
                       <a:fillRect/>
                     </a:stretch>
@@ -9554,7 +9605,7 @@
                     <pic:cNvPicPr/>
                   </pic:nvPicPr>
                   <pic:blipFill>
-                    <a:blip r:embed="rId13"/>
+                    <a:blip r:embed="rId14"/>
                     <a:stretch>
                       <a:fillRect/>
                     </a:stretch>
@@ -9712,7 +9763,7 @@
                     <pic:cNvPicPr/>
                   </pic:nvPicPr>
                   <pic:blipFill>
-                    <a:blip r:embed="rId14"/>
+                    <a:blip r:embed="rId15"/>
                     <a:stretch>
                       <a:fillRect/>
                     </a:stretch>
@@ -10055,7 +10106,7 @@
                     <pic:cNvPicPr/>
                   </pic:nvPicPr>
                   <pic:blipFill>
-                    <a:blip r:embed="rId15"/>
+                    <a:blip r:embed="rId16"/>
                     <a:stretch>
                       <a:fillRect/>
                     </a:stretch>
@@ -10163,7 +10214,7 @@
                     <pic:cNvPicPr/>
                   </pic:nvPicPr>
                   <pic:blipFill>
-                    <a:blip r:embed="rId16"/>
+                    <a:blip r:embed="rId17"/>
                     <a:stretch>
                       <a:fillRect/>
                     </a:stretch>
@@ -10246,10 +10297,7 @@
       <w:bookmarkStart w:id="19" w:name="_Toc238602819"/>
       <w:r>
         <w:lastRenderedPageBreak/>
-        <w:t xml:space="preserve">Business </w:t>
-      </w:r>
-      <w:r>
-        <w:t>Users</w:t>
+        <w:t>Business Users</w:t>
       </w:r>
       <w:bookmarkEnd w:id="19"/>
     </w:p>
@@ -10784,10 +10832,7 @@
         </w:numPr>
       </w:pPr>
       <w:r>
-        <w:t>Audit logs shall record user identity, timestamp, previous value, and new valu</w:t>
-      </w:r>
-      <w:r>
-        <w:t>e</w:t>
+        <w:t>Audit logs shall record user identity, timestamp, previous value, and new value</w:t>
       </w:r>
     </w:p>
     <w:p/>
@@ -11152,22 +11197,153 @@
     </w:p>
     <w:p>
       <w:pPr>
+        <w:pStyle w:val="Heading2"/>
+      </w:pPr>
+      <w:r>
+        <w:t>Conceptual Solution Architecture Diagram</w:t>
+      </w:r>
+    </w:p>
+    <w:p>
+      <w:pPr>
         <w:rPr>
           <w:lang w:val="en-US"/>
         </w:rPr>
       </w:pPr>
-      <w:r>
-        <w:rPr>
+    </w:p>
+    <w:p>
+      <w:r>
+        <w:rPr>
+          <w:noProof/>
+        </w:rPr>
+        <w:drawing>
+          <wp:inline distT="0" distB="0" distL="0" distR="0" wp14:anchorId="3864A5EF" wp14:editId="127D23BC">
+            <wp:extent cx="6358581" cy="2907102"/>
+            <wp:effectExtent l="19050" t="19050" r="23495" b="26670"/>
+            <wp:docPr id="98897698" name="Picture 2"/>
+            <wp:cNvGraphicFramePr>
+              <a:graphicFrameLocks xmlns:a="http://schemas.openxmlformats.org/drawingml/2006/main" noChangeAspect="1"/>
+            </wp:cNvGraphicFramePr>
+            <a:graphic xmlns:a="http://schemas.openxmlformats.org/drawingml/2006/main">
+              <a:graphicData uri="http://schemas.openxmlformats.org/drawingml/2006/picture">
+                <pic:pic xmlns:pic="http://schemas.openxmlformats.org/drawingml/2006/picture">
+                  <pic:nvPicPr>
+                    <pic:cNvPr id="98897698" name="Picture 98897698"/>
+                    <pic:cNvPicPr/>
+                  </pic:nvPicPr>
+                  <pic:blipFill>
+                    <a:blip r:embed="rId11"/>
+                    <a:stretch>
+                      <a:fillRect/>
+                    </a:stretch>
+                  </pic:blipFill>
+                  <pic:spPr>
+                    <a:xfrm>
+                      <a:off x="0" y="0"/>
+                      <a:ext cx="6373854" cy="2914085"/>
+                    </a:xfrm>
+                    <a:prstGeom prst="rect">
+                      <a:avLst/>
+                    </a:prstGeom>
+                    <a:ln>
+                      <a:solidFill>
+                        <a:schemeClr val="tx1"/>
+                      </a:solidFill>
+                    </a:ln>
+                  </pic:spPr>
+                </pic:pic>
+              </a:graphicData>
+            </a:graphic>
+          </wp:inline>
+        </w:drawing>
+      </w:r>
+    </w:p>
+    <w:p/>
+    <w:p>
+      <w:r>
+        <w:br w:type="page"/>
+      </w:r>
+    </w:p>
+    <w:p>
+      <w:pPr>
+        <w:pStyle w:val="Heading1"/>
+        <w:rPr>
+          <w:bCs/>
           <w:lang w:val="en-US"/>
         </w:rPr>
-        <w:t>aa</w:t>
-      </w:r>
+      </w:pPr>
+      <w:r>
+        <w:rPr>
+          <w:bCs/>
+          <w:lang w:val="en-US"/>
+        </w:rPr>
+        <w:lastRenderedPageBreak/>
+        <w:t>Solution</w:t>
+      </w:r>
+      <w:r>
+        <w:rPr>
+          <w:bCs/>
+          <w:lang w:val="en-US"/>
+        </w:rPr>
+        <w:t xml:space="preserve"> Architecture</w:t>
+      </w:r>
+    </w:p>
+    <w:p>
+      <w:pPr>
+        <w:pStyle w:val="Heading2"/>
+      </w:pPr>
+      <w:r>
+        <w:t>Data Object Inventory</w:t>
+      </w:r>
+    </w:p>
+    <w:p/>
+    <w:p>
+      <w:pPr>
+        <w:rPr>
+          <w:lang w:val="en-US"/>
+        </w:rPr>
+      </w:pPr>
+    </w:p>
+    <w:p>
+      <w:pPr>
+        <w:rPr>
+          <w:lang w:val="en-US"/>
+        </w:rPr>
+      </w:pPr>
+    </w:p>
+    <w:p>
+      <w:pPr>
+        <w:pStyle w:val="Heading2"/>
+      </w:pPr>
+      <w:r>
+        <w:t>Entity relationships</w:t>
+      </w:r>
+    </w:p>
+    <w:p>
+      <w:pPr>
+        <w:rPr>
+          <w:lang w:val="en-US"/>
+        </w:rPr>
+      </w:pPr>
+    </w:p>
+    <w:p>
+      <w:pPr>
+        <w:rPr>
+          <w:lang w:val="en-US"/>
+        </w:rPr>
+      </w:pPr>
+    </w:p>
+    <w:p>
+      <w:pPr>
+        <w:rPr>
+          <w:lang w:val="en-US"/>
+        </w:rPr>
+      </w:pPr>
     </w:p>
     <w:p/>
     <w:sectPr>
-      <w:headerReference w:type="default" r:id="rId17"/>
-      <w:footerReference w:type="default" r:id="rId18"/>
-      <w:footerReference w:type="first" r:id="rId19"/>
+      <w:headerReference w:type="default" r:id="rId18"/>
+      <w:footerReference w:type="default" r:id="rId19"/>
+      <w:footerReference w:type="first" r:id="rId20"/>
       <w:pgSz w:w="11909" w:h="16834" w:code="9"/>
       <w:pgMar w:top="1440" w:right="1440" w:bottom="1440" w:left="1440" w:header="709" w:footer="709" w:gutter="0"/>
       <w:cols w:space="720"/>
@@ -11178,7 +11354,7 @@
 </file>
 
 <file path=word/endnotes.xml><?xml version="1.0" encoding="utf-8"?>
-<w:endnotes xmlns:wpc="http://schemas.microsoft.com/office/word/2010/wordprocessingCanvas" xmlns:cx="http://schemas.microsoft.com/office/drawing/2014/chartex" xmlns:cx1="http://schemas.microsoft.com/office/drawing/2015/9/8/chartex" xmlns:cx2="http://schemas.microsoft.com/office/drawing/2015/10/21/chartex" xmlns:cx3="http://schemas.microsoft.com/office/drawing/2016/5/9/chartex" xmlns:cx4="http://schemas.microsoft.com/office/drawing/2016/5/10/chartex" xmlns:cx5="http://schemas.microsoft.com/office/drawing/2016/5/11/chartex" xmlns:cx6="http://schemas.microsoft.com/office/drawing/2016/5/12/chartex" xmlns:cx7="http://schemas.microsoft.com/office/drawing/2016/5/13/chartex" xmlns:cx8="http://schemas.microsoft.com/office/drawing/2016/5/14/chartex" xmlns:mc="http://schemas.openxmlformats.org/markup-compatibility/2006" xmlns:aink="http://schemas.microsoft.com/office/drawing/2016/ink" xmlns:am3d="http://schemas.microsoft.com/office/drawing/2017/model3d" xmlns:o="urn:schemas-microsoft-com:office:office" xmlns:oel="http://schemas.microsoft.com/office/2019/extlst" xmlns:r="http://schemas.openxmlformats.org/officeDocument/2006/relationships" xmlns:m="http://schemas.openxmlformats.org/officeDocument/2006/math" xmlns:v="urn:schemas-microsoft-com:vml" xmlns:wp14="http://schemas.microsoft.com/office/word/2010/wordprocessingDrawing" xmlns:wp="http://schemas.openxmlformats.org/drawingml/2006/wordprocessingDrawing" xmlns:w10="urn:schemas-microsoft-com:office:word" xmlns:w="http://schemas.openxmlformats.org/wordprocessingml/2006/main" xmlns:w14="http://schemas.microsoft.com/office/word/2010/wordml" xmlns:w15="http://schemas.microsoft.com/office/word/2012/wordml" xmlns:w16cei="http://schemas.microsoft.com/office/word/2026/wordml/cei" xmlns:w16cex="http://schemas.microsoft.com/office/word/2018/wordml/cex" xmlns:w16cid="http://schemas.microsoft.com/office/word/2016/wordml/cid" xmlns:w16="http://schemas.microsoft.com/office/word/2018/wordml" xmlns:w16du="http://schemas.microsoft.com/office/word/2023/wordml/word16du" xmlns:w16sdtdh="http://schemas.microsoft.com/office/word/2020/wordml/sdtdatahash" xmlns:w16sdtfl="http://schemas.microsoft.com/office/word/2024/wordml/sdtformatlock" xmlns:w16se="http://schemas.microsoft.com/office/word/2015/wordml/symex" xmlns:wpg="http://schemas.microsoft.com/office/word/2010/wordprocessingGroup" xmlns:wpi="http://schemas.microsoft.com/office/word/2010/wordprocessingInk" xmlns:wne="http://schemas.microsoft.com/office/word/2006/wordml" xmlns:wps="http://schemas.microsoft.com/office/word/2010/wordprocessingShape" mc:Ignorable="w14 w15 w16se w16cid w16 w16cex w16sdtdh w16sdtfl w16du wp14">
+<w:endnotes xmlns:wpc="http://schemas.microsoft.com/office/word/2010/wordprocessingCanvas" xmlns:cx="http://schemas.microsoft.com/office/drawing/2014/chartex" xmlns:cx1="http://schemas.microsoft.com/office/drawing/2015/9/8/chartex" xmlns:cx2="http://schemas.microsoft.com/office/drawing/2015/10/21/chartex" xmlns:cx3="http://schemas.microsoft.com/office/drawing/2016/5/9/chartex" xmlns:cx4="http://schemas.microsoft.com/office/drawing/2016/5/10/chartex" xmlns:cx5="http://schemas.microsoft.com/office/drawing/2016/5/11/chartex" xmlns:cx6="http://schemas.microsoft.com/office/drawing/2016/5/12/chartex" xmlns:cx7="http://schemas.microsoft.com/office/drawing/2016/5/13/chartex" xmlns:cx8="http://schemas.microsoft.com/office/drawing/2016/5/14/chartex" xmlns:mc="http://schemas.openxmlformats.org/markup-compatibility/2006" xmlns:aink="http://schemas.microsoft.com/office/drawing/2016/ink" xmlns:am3d="http://schemas.microsoft.com/office/drawing/2017/model3d" xmlns:o="urn:schemas-microsoft-com:office:office" xmlns:oel="http://schemas.microsoft.com/office/2019/extlst" xmlns:r="http://schemas.openxmlformats.org/officeDocument/2006/relationships" xmlns:m="http://schemas.openxmlformats.org/officeDocument/2006/math" xmlns:v="urn:schemas-microsoft-com:vml" xmlns:wp14="http://schemas.microsoft.com/office/word/2010/wordprocessingDrawing" xmlns:wp="http://schemas.openxmlformats.org/drawingml/2006/wordprocessingDrawing" xmlns:w10="urn:schemas-microsoft-com:office:word" xmlns:w="http://schemas.openxmlformats.org/wordprocessingml/2006/main" xmlns:w14="http://schemas.microsoft.com/office/word/2010/wordml" xmlns:w15="http://schemas.microsoft.com/office/word/2012/wordml" xmlns:w16cex="http://schemas.microsoft.com/office/word/2018/wordml/cex" xmlns:w16cid="http://schemas.microsoft.com/office/word/2016/wordml/cid" xmlns:w16="http://schemas.microsoft.com/office/word/2018/wordml" xmlns:w16du="http://schemas.microsoft.com/office/word/2023/wordml/word16du" xmlns:w16sdtdh="http://schemas.microsoft.com/office/word/2020/wordml/sdtdatahash" xmlns:w16sdtfl="http://schemas.microsoft.com/office/word/2024/wordml/sdtformatlock" xmlns:w16se="http://schemas.microsoft.com/office/word/2015/wordml/symex" xmlns:wpg="http://schemas.microsoft.com/office/word/2010/wordprocessingGroup" xmlns:wpi="http://schemas.microsoft.com/office/word/2010/wordprocessingInk" xmlns:wne="http://schemas.microsoft.com/office/word/2006/wordml" xmlns:wps="http://schemas.microsoft.com/office/word/2010/wordprocessingShape" mc:Ignorable="w14 w15 w16se w16cid w16 w16cex w16sdtdh w16sdtfl w16du wp14">
   <w:endnote w:type="separator" w:id="-1">
     <w:p>
       <w:r>
@@ -11197,7 +11373,7 @@
 </file>
 
 <file path=word/footer1.xml><?xml version="1.0" encoding="utf-8"?>
-<w:ftr xmlns:wpc="http://schemas.microsoft.com/office/word/2010/wordprocessingCanvas" xmlns:cx="http://schemas.microsoft.com/office/drawing/2014/chartex" xmlns:cx1="http://schemas.microsoft.com/office/drawing/2015/9/8/chartex" xmlns:cx2="http://schemas.microsoft.com/office/drawing/2015/10/21/chartex" xmlns:cx3="http://schemas.microsoft.com/office/drawing/2016/5/9/chartex" xmlns:cx4="http://schemas.microsoft.com/office/drawing/2016/5/10/chartex" xmlns:cx5="http://schemas.microsoft.com/office/drawing/2016/5/11/chartex" xmlns:cx6="http://schemas.microsoft.com/office/drawing/2016/5/12/chartex" xmlns:cx7="http://schemas.microsoft.com/office/drawing/2016/5/13/chartex" xmlns:cx8="http://schemas.microsoft.com/office/drawing/2016/5/14/chartex" xmlns:mc="http://schemas.openxmlformats.org/markup-compatibility/2006" xmlns:aink="http://schemas.microsoft.com/office/drawing/2016/ink" xmlns:am3d="http://schemas.microsoft.com/office/drawing/2017/model3d" xmlns:o="urn:schemas-microsoft-com:office:office" xmlns:oel="http://schemas.microsoft.com/office/2019/extlst" xmlns:r="http://schemas.openxmlformats.org/officeDocument/2006/relationships" xmlns:m="http://schemas.openxmlformats.org/officeDocument/2006/math" xmlns:v="urn:schemas-microsoft-com:vml" xmlns:wp14="http://schemas.microsoft.com/office/word/2010/wordprocessingDrawing" xmlns:wp="http://schemas.openxmlformats.org/drawingml/2006/wordprocessingDrawing" xmlns:w10="urn:schemas-microsoft-com:office:word" xmlns:w="http://schemas.openxmlformats.org/wordprocessingml/2006/main" xmlns:w14="http://schemas.microsoft.com/office/word/2010/wordml" xmlns:w15="http://schemas.microsoft.com/office/word/2012/wordml" xmlns:w16cei="http://schemas.microsoft.com/office/word/2026/wordml/cei" xmlns:w16cex="http://schemas.microsoft.com/office/word/2018/wordml/cex" xmlns:w16cid="http://schemas.microsoft.com/office/word/2016/wordml/cid" xmlns:w16="http://schemas.microsoft.com/office/word/2018/wordml" xmlns:w16du="http://schemas.microsoft.com/office/word/2023/wordml/word16du" xmlns:w16sdtdh="http://schemas.microsoft.com/office/word/2020/wordml/sdtdatahash" xmlns:w16sdtfl="http://schemas.microsoft.com/office/word/2024/wordml/sdtformatlock" xmlns:w16se="http://schemas.microsoft.com/office/word/2015/wordml/symex" xmlns:wpg="http://schemas.microsoft.com/office/word/2010/wordprocessingGroup" xmlns:wpi="http://schemas.microsoft.com/office/word/2010/wordprocessingInk" xmlns:wne="http://schemas.microsoft.com/office/word/2006/wordml" xmlns:wps="http://schemas.microsoft.com/office/word/2010/wordprocessingShape" mc:Ignorable="w14 w15 w16se w16cid w16 w16cex w16sdtdh w16sdtfl w16du wp14">
+<w:ftr xmlns:wpc="http://schemas.microsoft.com/office/word/2010/wordprocessingCanvas" xmlns:cx="http://schemas.microsoft.com/office/drawing/2014/chartex" xmlns:cx1="http://schemas.microsoft.com/office/drawing/2015/9/8/chartex" xmlns:cx2="http://schemas.microsoft.com/office/drawing/2015/10/21/chartex" xmlns:cx3="http://schemas.microsoft.com/office/drawing/2016/5/9/chartex" xmlns:cx4="http://schemas.microsoft.com/office/drawing/2016/5/10/chartex" xmlns:cx5="http://schemas.microsoft.com/office/drawing/2016/5/11/chartex" xmlns:cx6="http://schemas.microsoft.com/office/drawing/2016/5/12/chartex" xmlns:cx7="http://schemas.microsoft.com/office/drawing/2016/5/13/chartex" xmlns:cx8="http://schemas.microsoft.com/office/drawing/2016/5/14/chartex" xmlns:mc="http://schemas.openxmlformats.org/markup-compatibility/2006" xmlns:aink="http://schemas.microsoft.com/office/drawing/2016/ink" xmlns:am3d="http://schemas.microsoft.com/office/drawing/2017/model3d" xmlns:o="urn:schemas-microsoft-com:office:office" xmlns:oel="http://schemas.microsoft.com/office/2019/extlst" xmlns:r="http://schemas.openxmlformats.org/officeDocument/2006/relationships" xmlns:m="http://schemas.openxmlformats.org/officeDocument/2006/math" xmlns:v="urn:schemas-microsoft-com:vml" xmlns:wp14="http://schemas.microsoft.com/office/word/2010/wordprocessingDrawing" xmlns:wp="http://schemas.openxmlformats.org/drawingml/2006/wordprocessingDrawing" xmlns:w10="urn:schemas-microsoft-com:office:word" xmlns:w="http://schemas.openxmlformats.org/wordprocessingml/2006/main" xmlns:w14="http://schemas.microsoft.com/office/word/2010/wordml" xmlns:w15="http://schemas.microsoft.com/office/word/2012/wordml" xmlns:w16cex="http://schemas.microsoft.com/office/word/2018/wordml/cex" xmlns:w16cid="http://schemas.microsoft.com/office/word/2016/wordml/cid" xmlns:w16="http://schemas.microsoft.com/office/word/2018/wordml" xmlns:w16du="http://schemas.microsoft.com/office/word/2023/wordml/word16du" xmlns:w16sdtdh="http://schemas.microsoft.com/office/word/2020/wordml/sdtdatahash" xmlns:w16sdtfl="http://schemas.microsoft.com/office/word/2024/wordml/sdtformatlock" xmlns:w16se="http://schemas.microsoft.com/office/word/2015/wordml/symex" xmlns:wpg="http://schemas.microsoft.com/office/word/2010/wordprocessingGroup" xmlns:wpi="http://schemas.microsoft.com/office/word/2010/wordprocessingInk" xmlns:wne="http://schemas.microsoft.com/office/word/2006/wordml" xmlns:wps="http://schemas.microsoft.com/office/word/2010/wordprocessingShape" mc:Ignorable="w14 w15 w16se w16cid w16 w16cex w16sdtdh w16sdtfl w16du wp14">
   <w:p>
     <w:pPr>
       <w:pStyle w:val="Footer"/>
@@ -11309,7 +11485,7 @@
 </file>
 
 <file path=word/footer2.xml><?xml version="1.0" encoding="utf-8"?>
-<w:ftr xmlns:wpc="http://schemas.microsoft.com/office/word/2010/wordprocessingCanvas" xmlns:cx="http://schemas.microsoft.com/office/drawing/2014/chartex" xmlns:cx1="http://schemas.microsoft.com/office/drawing/2015/9/8/chartex" xmlns:cx2="http://schemas.microsoft.com/office/drawing/2015/10/21/chartex" xmlns:cx3="http://schemas.microsoft.com/office/drawing/2016/5/9/chartex" xmlns:cx4="http://schemas.microsoft.com/office/drawing/2016/5/10/chartex" xmlns:cx5="http://schemas.microsoft.com/office/drawing/2016/5/11/chartex" xmlns:cx6="http://schemas.microsoft.com/office/drawing/2016/5/12/chartex" xmlns:cx7="http://schemas.microsoft.com/office/drawing/2016/5/13/chartex" xmlns:cx8="http://schemas.microsoft.com/office/drawing/2016/5/14/chartex" xmlns:mc="http://schemas.openxmlformats.org/markup-compatibility/2006" xmlns:aink="http://schemas.microsoft.com/office/drawing/2016/ink" xmlns:am3d="http://schemas.microsoft.com/office/drawing/2017/model3d" xmlns:o="urn:schemas-microsoft-com:office:office" xmlns:oel="http://schemas.microsoft.com/office/2019/extlst" xmlns:r="http://schemas.openxmlformats.org/officeDocument/2006/relationships" xmlns:m="http://schemas.openxmlformats.org/officeDocument/2006/math" xmlns:v="urn:schemas-microsoft-com:vml" xmlns:wp14="http://schemas.microsoft.com/office/word/2010/wordprocessingDrawing" xmlns:wp="http://schemas.openxmlformats.org/drawingml/2006/wordprocessingDrawing" xmlns:w10="urn:schemas-microsoft-com:office:word" xmlns:w="http://schemas.openxmlformats.org/wordprocessingml/2006/main" xmlns:w14="http://schemas.microsoft.com/office/word/2010/wordml" xmlns:w15="http://schemas.microsoft.com/office/word/2012/wordml" xmlns:w16cei="http://schemas.microsoft.com/office/word/2026/wordml/cei" xmlns:w16cex="http://schemas.microsoft.com/office/word/2018/wordml/cex" xmlns:w16cid="http://schemas.microsoft.com/office/word/2016/wordml/cid" xmlns:w16="http://schemas.microsoft.com/office/word/2018/wordml" xmlns:w16du="http://schemas.microsoft.com/office/word/2023/wordml/word16du" xmlns:w16sdtdh="http://schemas.microsoft.com/office/word/2020/wordml/sdtdatahash" xmlns:w16sdtfl="http://schemas.microsoft.com/office/word/2024/wordml/sdtformatlock" xmlns:w16se="http://schemas.microsoft.com/office/word/2015/wordml/symex" xmlns:wpg="http://schemas.microsoft.com/office/word/2010/wordprocessingGroup" xmlns:wpi="http://schemas.microsoft.com/office/word/2010/wordprocessingInk" xmlns:wne="http://schemas.microsoft.com/office/word/2006/wordml" xmlns:wps="http://schemas.microsoft.com/office/word/2010/wordprocessingShape" mc:Ignorable="w14 w15 w16se w16cid w16 w16cex w16sdtdh w16sdtfl w16du wp14">
+<w:ftr xmlns:wpc="http://schemas.microsoft.com/office/word/2010/wordprocessingCanvas" xmlns:cx="http://schemas.microsoft.com/office/drawing/2014/chartex" xmlns:cx1="http://schemas.microsoft.com/office/drawing/2015/9/8/chartex" xmlns:cx2="http://schemas.microsoft.com/office/drawing/2015/10/21/chartex" xmlns:cx3="http://schemas.microsoft.com/office/drawing/2016/5/9/chartex" xmlns:cx4="http://schemas.microsoft.com/office/drawing/2016/5/10/chartex" xmlns:cx5="http://schemas.microsoft.com/office/drawing/2016/5/11/chartex" xmlns:cx6="http://schemas.microsoft.com/office/drawing/2016/5/12/chartex" xmlns:cx7="http://schemas.microsoft.com/office/drawing/2016/5/13/chartex" xmlns:cx8="http://schemas.microsoft.com/office/drawing/2016/5/14/chartex" xmlns:mc="http://schemas.openxmlformats.org/markup-compatibility/2006" xmlns:aink="http://schemas.microsoft.com/office/drawing/2016/ink" xmlns:am3d="http://schemas.microsoft.com/office/drawing/2017/model3d" xmlns:o="urn:schemas-microsoft-com:office:office" xmlns:oel="http://schemas.microsoft.com/office/2019/extlst" xmlns:r="http://schemas.openxmlformats.org/officeDocument/2006/relationships" xmlns:m="http://schemas.openxmlformats.org/officeDocument/2006/math" xmlns:v="urn:schemas-microsoft-com:vml" xmlns:wp14="http://schemas.microsoft.com/office/word/2010/wordprocessingDrawing" xmlns:wp="http://schemas.openxmlformats.org/drawingml/2006/wordprocessingDrawing" xmlns:w10="urn:schemas-microsoft-com:office:word" xmlns:w="http://schemas.openxmlformats.org/wordprocessingml/2006/main" xmlns:w14="http://schemas.microsoft.com/office/word/2010/wordml" xmlns:w15="http://schemas.microsoft.com/office/word/2012/wordml" xmlns:w16cex="http://schemas.microsoft.com/office/word/2018/wordml/cex" xmlns:w16cid="http://schemas.microsoft.com/office/word/2016/wordml/cid" xmlns:w16="http://schemas.microsoft.com/office/word/2018/wordml" xmlns:w16du="http://schemas.microsoft.com/office/word/2023/wordml/word16du" xmlns:w16sdtdh="http://schemas.microsoft.com/office/word/2020/wordml/sdtdatahash" xmlns:w16sdtfl="http://schemas.microsoft.com/office/word/2024/wordml/sdtformatlock" xmlns:w16se="http://schemas.microsoft.com/office/word/2015/wordml/symex" xmlns:wpg="http://schemas.microsoft.com/office/word/2010/wordprocessingGroup" xmlns:wpi="http://schemas.microsoft.com/office/word/2010/wordprocessingInk" xmlns:wne="http://schemas.microsoft.com/office/word/2006/wordml" xmlns:wps="http://schemas.microsoft.com/office/word/2010/wordprocessingShape" mc:Ignorable="w14 w15 w16se w16cid w16 w16cex w16sdtdh w16sdtfl w16du wp14">
   <w:p>
     <w:pPr>
       <w:pStyle w:val="Footer"/>
@@ -11319,7 +11495,7 @@
 </file>
 
 <file path=word/footer3.xml><?xml version="1.0" encoding="utf-8"?>
-<w:ftr xmlns:wpc="http://schemas.microsoft.com/office/word/2010/wordprocessingCanvas" xmlns:cx="http://schemas.microsoft.com/office/drawing/2014/chartex" xmlns:cx1="http://schemas.microsoft.com/office/drawing/2015/9/8/chartex" xmlns:cx2="http://schemas.microsoft.com/office/drawing/2015/10/21/chartex" xmlns:cx3="http://schemas.microsoft.com/office/drawing/2016/5/9/chartex" xmlns:cx4="http://schemas.microsoft.com/office/drawing/2016/5/10/chartex" xmlns:cx5="http://schemas.microsoft.com/office/drawing/2016/5/11/chartex" xmlns:cx6="http://schemas.microsoft.com/office/drawing/2016/5/12/chartex" xmlns:cx7="http://schemas.microsoft.com/office/drawing/2016/5/13/chartex" xmlns:cx8="http://schemas.microsoft.com/office/drawing/2016/5/14/chartex" xmlns:mc="http://schemas.openxmlformats.org/markup-compatibility/2006" xmlns:aink="http://schemas.microsoft.com/office/drawing/2016/ink" xmlns:am3d="http://schemas.microsoft.com/office/drawing/2017/model3d" xmlns:o="urn:schemas-microsoft-com:office:office" xmlns:oel="http://schemas.microsoft.com/office/2019/extlst" xmlns:r="http://schemas.openxmlformats.org/officeDocument/2006/relationships" xmlns:m="http://schemas.openxmlformats.org/officeDocument/2006/math" xmlns:v="urn:schemas-microsoft-com:vml" xmlns:wp14="http://schemas.microsoft.com/office/word/2010/wordprocessingDrawing" xmlns:wp="http://schemas.openxmlformats.org/drawingml/2006/wordprocessingDrawing" xmlns:w10="urn:schemas-microsoft-com:office:word" xmlns:w="http://schemas.openxmlformats.org/wordprocessingml/2006/main" xmlns:w14="http://schemas.microsoft.com/office/word/2010/wordml" xmlns:w15="http://schemas.microsoft.com/office/word/2012/wordml" xmlns:w16cei="http://schemas.microsoft.com/office/word/2026/wordml/cei" xmlns:w16cex="http://schemas.microsoft.com/office/word/2018/wordml/cex" xmlns:w16cid="http://schemas.microsoft.com/office/word/2016/wordml/cid" xmlns:w16="http://schemas.microsoft.com/office/word/2018/wordml" xmlns:w16du="http://schemas.microsoft.com/office/word/2023/wordml/word16du" xmlns:w16sdtdh="http://schemas.microsoft.com/office/word/2020/wordml/sdtdatahash" xmlns:w16sdtfl="http://schemas.microsoft.com/office/word/2024/wordml/sdtformatlock" xmlns:w16se="http://schemas.microsoft.com/office/word/2015/wordml/symex" xmlns:wpg="http://schemas.microsoft.com/office/word/2010/wordprocessingGroup" xmlns:wpi="http://schemas.microsoft.com/office/word/2010/wordprocessingInk" xmlns:wne="http://schemas.microsoft.com/office/word/2006/wordml" xmlns:wps="http://schemas.microsoft.com/office/word/2010/wordprocessingShape" mc:Ignorable="w14 w15 w16se w16cid w16 w16cex w16sdtdh w16sdtfl w16du wp14">
+<w:ftr xmlns:wpc="http://schemas.microsoft.com/office/word/2010/wordprocessingCanvas" xmlns:cx="http://schemas.microsoft.com/office/drawing/2014/chartex" xmlns:cx1="http://schemas.microsoft.com/office/drawing/2015/9/8/chartex" xmlns:cx2="http://schemas.microsoft.com/office/drawing/2015/10/21/chartex" xmlns:cx3="http://schemas.microsoft.com/office/drawing/2016/5/9/chartex" xmlns:cx4="http://schemas.microsoft.com/office/drawing/2016/5/10/chartex" xmlns:cx5="http://schemas.microsoft.com/office/drawing/2016/5/11/chartex" xmlns:cx6="http://schemas.microsoft.com/office/drawing/2016/5/12/chartex" xmlns:cx7="http://schemas.microsoft.com/office/drawing/2016/5/13/chartex" xmlns:cx8="http://schemas.microsoft.com/office/drawing/2016/5/14/chartex" xmlns:mc="http://schemas.openxmlformats.org/markup-compatibility/2006" xmlns:aink="http://schemas.microsoft.com/office/drawing/2016/ink" xmlns:am3d="http://schemas.microsoft.com/office/drawing/2017/model3d" xmlns:o="urn:schemas-microsoft-com:office:office" xmlns:oel="http://schemas.microsoft.com/office/2019/extlst" xmlns:r="http://schemas.openxmlformats.org/officeDocument/2006/relationships" xmlns:m="http://schemas.openxmlformats.org/officeDocument/2006/math" xmlns:v="urn:schemas-microsoft-com:vml" xmlns:wp14="http://schemas.microsoft.com/office/word/2010/wordprocessingDrawing" xmlns:wp="http://schemas.openxmlformats.org/drawingml/2006/wordprocessingDrawing" xmlns:w10="urn:schemas-microsoft-com:office:word" xmlns:w="http://schemas.openxmlformats.org/wordprocessingml/2006/main" xmlns:w14="http://schemas.microsoft.com/office/word/2010/wordml" xmlns:w15="http://schemas.microsoft.com/office/word/2012/wordml" xmlns:w16cex="http://schemas.microsoft.com/office/word/2018/wordml/cex" xmlns:w16cid="http://schemas.microsoft.com/office/word/2016/wordml/cid" xmlns:w16="http://schemas.microsoft.com/office/word/2018/wordml" xmlns:w16du="http://schemas.microsoft.com/office/word/2023/wordml/word16du" xmlns:w16sdtdh="http://schemas.microsoft.com/office/word/2020/wordml/sdtdatahash" xmlns:w16sdtfl="http://schemas.microsoft.com/office/word/2024/wordml/sdtformatlock" xmlns:w16se="http://schemas.microsoft.com/office/word/2015/wordml/symex" xmlns:wpg="http://schemas.microsoft.com/office/word/2010/wordprocessingGroup" xmlns:wpi="http://schemas.microsoft.com/office/word/2010/wordprocessingInk" xmlns:wne="http://schemas.microsoft.com/office/word/2006/wordml" xmlns:wps="http://schemas.microsoft.com/office/word/2010/wordprocessingShape" mc:Ignorable="w14 w15 w16se w16cid w16 w16cex w16sdtdh w16sdtfl w16du wp14">
   <w:p>
     <w:pPr>
       <w:pStyle w:val="Footer"/>
@@ -11436,7 +11612,7 @@
 </file>
 
 <file path=word/footer4.xml><?xml version="1.0" encoding="utf-8"?>
-<w:ftr xmlns:wpc="http://schemas.microsoft.com/office/word/2010/wordprocessingCanvas" xmlns:cx="http://schemas.microsoft.com/office/drawing/2014/chartex" xmlns:cx1="http://schemas.microsoft.com/office/drawing/2015/9/8/chartex" xmlns:cx2="http://schemas.microsoft.com/office/drawing/2015/10/21/chartex" xmlns:cx3="http://schemas.microsoft.com/office/drawing/2016/5/9/chartex" xmlns:cx4="http://schemas.microsoft.com/office/drawing/2016/5/10/chartex" xmlns:cx5="http://schemas.microsoft.com/office/drawing/2016/5/11/chartex" xmlns:cx6="http://schemas.microsoft.com/office/drawing/2016/5/12/chartex" xmlns:cx7="http://schemas.microsoft.com/office/drawing/2016/5/13/chartex" xmlns:cx8="http://schemas.microsoft.com/office/drawing/2016/5/14/chartex" xmlns:mc="http://schemas.openxmlformats.org/markup-compatibility/2006" xmlns:aink="http://schemas.microsoft.com/office/drawing/2016/ink" xmlns:am3d="http://schemas.microsoft.com/office/drawing/2017/model3d" xmlns:o="urn:schemas-microsoft-com:office:office" xmlns:oel="http://schemas.microsoft.com/office/2019/extlst" xmlns:r="http://schemas.openxmlformats.org/officeDocument/2006/relationships" xmlns:m="http://schemas.openxmlformats.org/officeDocument/2006/math" xmlns:v="urn:schemas-microsoft-com:vml" xmlns:wp14="http://schemas.microsoft.com/office/word/2010/wordprocessingDrawing" xmlns:wp="http://schemas.openxmlformats.org/drawingml/2006/wordprocessingDrawing" xmlns:w10="urn:schemas-microsoft-com:office:word" xmlns:w="http://schemas.openxmlformats.org/wordprocessingml/2006/main" xmlns:w14="http://schemas.microsoft.com/office/word/2010/wordml" xmlns:w15="http://schemas.microsoft.com/office/word/2012/wordml" xmlns:w16cei="http://schemas.microsoft.com/office/word/2026/wordml/cei" xmlns:w16cex="http://schemas.microsoft.com/office/word/2018/wordml/cex" xmlns:w16cid="http://schemas.microsoft.com/office/word/2016/wordml/cid" xmlns:w16="http://schemas.microsoft.com/office/word/2018/wordml" xmlns:w16du="http://schemas.microsoft.com/office/word/2023/wordml/word16du" xmlns:w16sdtdh="http://schemas.microsoft.com/office/word/2020/wordml/sdtdatahash" xmlns:w16sdtfl="http://schemas.microsoft.com/office/word/2024/wordml/sdtformatlock" xmlns:w16se="http://schemas.microsoft.com/office/word/2015/wordml/symex" xmlns:wpg="http://schemas.microsoft.com/office/word/2010/wordprocessingGroup" xmlns:wpi="http://schemas.microsoft.com/office/word/2010/wordprocessingInk" xmlns:wne="http://schemas.microsoft.com/office/word/2006/wordml" xmlns:wps="http://schemas.microsoft.com/office/word/2010/wordprocessingShape" mc:Ignorable="w14 w15 w16se w16cid w16 w16cex w16sdtdh w16sdtfl w16du wp14">
+<w:ftr xmlns:wpc="http://schemas.microsoft.com/office/word/2010/wordprocessingCanvas" xmlns:cx="http://schemas.microsoft.com/office/drawing/2014/chartex" xmlns:cx1="http://schemas.microsoft.com/office/drawing/2015/9/8/chartex" xmlns:cx2="http://schemas.microsoft.com/office/drawing/2015/10/21/chartex" xmlns:cx3="http://schemas.microsoft.com/office/drawing/2016/5/9/chartex" xmlns:cx4="http://schemas.microsoft.com/office/drawing/2016/5/10/chartex" xmlns:cx5="http://schemas.microsoft.com/office/drawing/2016/5/11/chartex" xmlns:cx6="http://schemas.microsoft.com/office/drawing/2016/5/12/chartex" xmlns:cx7="http://schemas.microsoft.com/office/drawing/2016/5/13/chartex" xmlns:cx8="http://schemas.microsoft.com/office/drawing/2016/5/14/chartex" xmlns:mc="http://schemas.openxmlformats.org/markup-compatibility/2006" xmlns:aink="http://schemas.microsoft.com/office/drawing/2016/ink" xmlns:am3d="http://schemas.microsoft.com/office/drawing/2017/model3d" xmlns:o="urn:schemas-microsoft-com:office:office" xmlns:oel="http://schemas.microsoft.com/office/2019/extlst" xmlns:r="http://schemas.openxmlformats.org/officeDocument/2006/relationships" xmlns:m="http://schemas.openxmlformats.org/officeDocument/2006/math" xmlns:v="urn:schemas-microsoft-com:vml" xmlns:wp14="http://schemas.microsoft.com/office/word/2010/wordprocessingDrawing" xmlns:wp="http://schemas.openxmlformats.org/drawingml/2006/wordprocessingDrawing" xmlns:w10="urn:schemas-microsoft-com:office:word" xmlns:w="http://schemas.openxmlformats.org/wordprocessingml/2006/main" xmlns:w14="http://schemas.microsoft.com/office/word/2010/wordml" xmlns:w15="http://schemas.microsoft.com/office/word/2012/wordml" xmlns:w16cex="http://schemas.microsoft.com/office/word/2018/wordml/cex" xmlns:w16cid="http://schemas.microsoft.com/office/word/2016/wordml/cid" xmlns:w16="http://schemas.microsoft.com/office/word/2018/wordml" xmlns:w16du="http://schemas.microsoft.com/office/word/2023/wordml/word16du" xmlns:w16sdtdh="http://schemas.microsoft.com/office/word/2020/wordml/sdtdatahash" xmlns:w16sdtfl="http://schemas.microsoft.com/office/word/2024/wordml/sdtformatlock" xmlns:w16se="http://schemas.microsoft.com/office/word/2015/wordml/symex" xmlns:wpg="http://schemas.microsoft.com/office/word/2010/wordprocessingGroup" xmlns:wpi="http://schemas.microsoft.com/office/word/2010/wordprocessingInk" xmlns:wne="http://schemas.microsoft.com/office/word/2006/wordml" xmlns:wps="http://schemas.microsoft.com/office/word/2010/wordprocessingShape" mc:Ignorable="w14 w15 w16se w16cid w16 w16cex w16sdtdh w16sdtfl w16du wp14">
   <w:tbl>
     <w:tblPr>
       <w:tblW w:w="0" w:type="auto"/>
@@ -11622,7 +11798,7 @@
 </file>
 
 <file path=word/footnotes.xml><?xml version="1.0" encoding="utf-8"?>
-<w:footnotes xmlns:wpc="http://schemas.microsoft.com/office/word/2010/wordprocessingCanvas" xmlns:cx="http://schemas.microsoft.com/office/drawing/2014/chartex" xmlns:cx1="http://schemas.microsoft.com/office/drawing/2015/9/8/chartex" xmlns:cx2="http://schemas.microsoft.com/office/drawing/2015/10/21/chartex" xmlns:cx3="http://schemas.microsoft.com/office/drawing/2016/5/9/chartex" xmlns:cx4="http://schemas.microsoft.com/office/drawing/2016/5/10/chartex" xmlns:cx5="http://schemas.microsoft.com/office/drawing/2016/5/11/chartex" xmlns:cx6="http://schemas.microsoft.com/office/drawing/2016/5/12/chartex" xmlns:cx7="http://schemas.microsoft.com/office/drawing/2016/5/13/chartex" xmlns:cx8="http://schemas.microsoft.com/office/drawing/2016/5/14/chartex" xmlns:mc="http://schemas.openxmlformats.org/markup-compatibility/2006" xmlns:aink="http://schemas.microsoft.com/office/drawing/2016/ink" xmlns:am3d="http://schemas.microsoft.com/office/drawing/2017/model3d" xmlns:o="urn:schemas-microsoft-com:office:office" xmlns:oel="http://schemas.microsoft.com/office/2019/extlst" xmlns:r="http://schemas.openxmlformats.org/officeDocument/2006/relationships" xmlns:m="http://schemas.openxmlformats.org/officeDocument/2006/math" xmlns:v="urn:schemas-microsoft-com:vml" xmlns:wp14="http://schemas.microsoft.com/office/word/2010/wordprocessingDrawing" xmlns:wp="http://schemas.openxmlformats.org/drawingml/2006/wordprocessingDrawing" xmlns:w10="urn:schemas-microsoft-com:office:word" xmlns:w="http://schemas.openxmlformats.org/wordprocessingml/2006/main" xmlns:w14="http://schemas.microsoft.com/office/word/2010/wordml" xmlns:w15="http://schemas.microsoft.com/office/word/2012/wordml" xmlns:w16cei="http://schemas.microsoft.com/office/word/2026/wordml/cei" xmlns:w16cex="http://schemas.microsoft.com/office/word/2018/wordml/cex" xmlns:w16cid="http://schemas.microsoft.com/office/word/2016/wordml/cid" xmlns:w16="http://schemas.microsoft.com/office/word/2018/wordml" xmlns:w16du="http://schemas.microsoft.com/office/word/2023/wordml/word16du" xmlns:w16sdtdh="http://schemas.microsoft.com/office/word/2020/wordml/sdtdatahash" xmlns:w16sdtfl="http://schemas.microsoft.com/office/word/2024/wordml/sdtformatlock" xmlns:w16se="http://schemas.microsoft.com/office/word/2015/wordml/symex" xmlns:wpg="http://schemas.microsoft.com/office/word/2010/wordprocessingGroup" xmlns:wpi="http://schemas.microsoft.com/office/word/2010/wordprocessingInk" xmlns:wne="http://schemas.microsoft.com/office/word/2006/wordml" xmlns:wps="http://schemas.microsoft.com/office/word/2010/wordprocessingShape" mc:Ignorable="w14 w15 w16se w16cid w16 w16cex w16sdtdh w16sdtfl w16du wp14">
+<w:footnotes xmlns:wpc="http://schemas.microsoft.com/office/word/2010/wordprocessingCanvas" xmlns:cx="http://schemas.microsoft.com/office/drawing/2014/chartex" xmlns:cx1="http://schemas.microsoft.com/office/drawing/2015/9/8/chartex" xmlns:cx2="http://schemas.microsoft.com/office/drawing/2015/10/21/chartex" xmlns:cx3="http://schemas.microsoft.com/office/drawing/2016/5/9/chartex" xmlns:cx4="http://schemas.microsoft.com/office/drawing/2016/5/10/chartex" xmlns:cx5="http://schemas.microsoft.com/office/drawing/2016/5/11/chartex" xmlns:cx6="http://schemas.microsoft.com/office/drawing/2016/5/12/chartex" xmlns:cx7="http://schemas.microsoft.com/office/drawing/2016/5/13/chartex" xmlns:cx8="http://schemas.microsoft.com/office/drawing/2016/5/14/chartex" xmlns:mc="http://schemas.openxmlformats.org/markup-compatibility/2006" xmlns:aink="http://schemas.microsoft.com/office/drawing/2016/ink" xmlns:am3d="http://schemas.microsoft.com/office/drawing/2017/model3d" xmlns:o="urn:schemas-microsoft-com:office:office" xmlns:oel="http://schemas.microsoft.com/office/2019/extlst" xmlns:r="http://schemas.openxmlformats.org/officeDocument/2006/relationships" xmlns:m="http://schemas.openxmlformats.org/officeDocument/2006/math" xmlns:v="urn:schemas-microsoft-com:vml" xmlns:wp14="http://schemas.microsoft.com/office/word/2010/wordprocessingDrawing" xmlns:wp="http://schemas.openxmlformats.org/drawingml/2006/wordprocessingDrawing" xmlns:w10="urn:schemas-microsoft-com:office:word" xmlns:w="http://schemas.openxmlformats.org/wordprocessingml/2006/main" xmlns:w14="http://schemas.microsoft.com/office/word/2010/wordml" xmlns:w15="http://schemas.microsoft.com/office/word/2012/wordml" xmlns:w16cex="http://schemas.microsoft.com/office/word/2018/wordml/cex" xmlns:w16cid="http://schemas.microsoft.com/office/word/2016/wordml/cid" xmlns:w16="http://schemas.microsoft.com/office/word/2018/wordml" xmlns:w16du="http://schemas.microsoft.com/office/word/2023/wordml/word16du" xmlns:w16sdtdh="http://schemas.microsoft.com/office/word/2020/wordml/sdtdatahash" xmlns:w16sdtfl="http://schemas.microsoft.com/office/word/2024/wordml/sdtformatlock" xmlns:w16se="http://schemas.microsoft.com/office/word/2015/wordml/symex" xmlns:wpg="http://schemas.microsoft.com/office/word/2010/wordprocessingGroup" xmlns:wpi="http://schemas.microsoft.com/office/word/2010/wordprocessingInk" xmlns:wne="http://schemas.microsoft.com/office/word/2006/wordml" xmlns:wps="http://schemas.microsoft.com/office/word/2010/wordprocessingShape" mc:Ignorable="w14 w15 w16se w16cid w16 w16cex w16sdtdh w16sdtfl w16du wp14">
   <w:footnote w:type="separator" w:id="-1">
     <w:p>
       <w:r>
@@ -11641,7 +11817,7 @@
 </file>
 
 <file path=word/header1.xml><?xml version="1.0" encoding="utf-8"?>
-<w:hdr xmlns:wpc="http://schemas.microsoft.com/office/word/2010/wordprocessingCanvas" xmlns:cx="http://schemas.microsoft.com/office/drawing/2014/chartex" xmlns:cx1="http://schemas.microsoft.com/office/drawing/2015/9/8/chartex" xmlns:cx2="http://schemas.microsoft.com/office/drawing/2015/10/21/chartex" xmlns:cx3="http://schemas.microsoft.com/office/drawing/2016/5/9/chartex" xmlns:cx4="http://schemas.microsoft.com/office/drawing/2016/5/10/chartex" xmlns:cx5="http://schemas.microsoft.com/office/drawing/2016/5/11/chartex" xmlns:cx6="http://schemas.microsoft.com/office/drawing/2016/5/12/chartex" xmlns:cx7="http://schemas.microsoft.com/office/drawing/2016/5/13/chartex" xmlns:cx8="http://schemas.microsoft.com/office/drawing/2016/5/14/chartex" xmlns:mc="http://schemas.openxmlformats.org/markup-compatibility/2006" xmlns:aink="http://schemas.microsoft.com/office/drawing/2016/ink" xmlns:am3d="http://schemas.microsoft.com/office/drawing/2017/model3d" xmlns:o="urn:schemas-microsoft-com:office:office" xmlns:oel="http://schemas.microsoft.com/office/2019/extlst" xmlns:r="http://schemas.openxmlformats.org/officeDocument/2006/relationships" xmlns:m="http://schemas.openxmlformats.org/officeDocument/2006/math" xmlns:v="urn:schemas-microsoft-com:vml" xmlns:wp14="http://schemas.microsoft.com/office/word/2010/wordprocessingDrawing" xmlns:wp="http://schemas.openxmlformats.org/drawingml/2006/wordprocessingDrawing" xmlns:w10="urn:schemas-microsoft-com:office:word" xmlns:w="http://schemas.openxmlformats.org/wordprocessingml/2006/main" xmlns:w14="http://schemas.microsoft.com/office/word/2010/wordml" xmlns:w15="http://schemas.microsoft.com/office/word/2012/wordml" xmlns:w16cei="http://schemas.microsoft.com/office/word/2026/wordml/cei" xmlns:w16cex="http://schemas.microsoft.com/office/word/2018/wordml/cex" xmlns:w16cid="http://schemas.microsoft.com/office/word/2016/wordml/cid" xmlns:w16="http://schemas.microsoft.com/office/word/2018/wordml" xmlns:w16du="http://schemas.microsoft.com/office/word/2023/wordml/word16du" xmlns:w16sdtdh="http://schemas.microsoft.com/office/word/2020/wordml/sdtdatahash" xmlns:w16sdtfl="http://schemas.microsoft.com/office/word/2024/wordml/sdtformatlock" xmlns:w16se="http://schemas.microsoft.com/office/word/2015/wordml/symex" xmlns:wpg="http://schemas.microsoft.com/office/word/2010/wordprocessingGroup" xmlns:wpi="http://schemas.microsoft.com/office/word/2010/wordprocessingInk" xmlns:wne="http://schemas.microsoft.com/office/word/2006/wordml" xmlns:wps="http://schemas.microsoft.com/office/word/2010/wordprocessingShape" mc:Ignorable="w14 w15 w16se w16cid w16 w16cex w16sdtdh w16sdtfl w16du wp14">
+<w:hdr xmlns:wpc="http://schemas.microsoft.com/office/word/2010/wordprocessingCanvas" xmlns:cx="http://schemas.microsoft.com/office/drawing/2014/chartex" xmlns:cx1="http://schemas.microsoft.com/office/drawing/2015/9/8/chartex" xmlns:cx2="http://schemas.microsoft.com/office/drawing/2015/10/21/chartex" xmlns:cx3="http://schemas.microsoft.com/office/drawing/2016/5/9/chartex" xmlns:cx4="http://schemas.microsoft.com/office/drawing/2016/5/10/chartex" xmlns:cx5="http://schemas.microsoft.com/office/drawing/2016/5/11/chartex" xmlns:cx6="http://schemas.microsoft.com/office/drawing/2016/5/12/chartex" xmlns:cx7="http://schemas.microsoft.com/office/drawing/2016/5/13/chartex" xmlns:cx8="http://schemas.microsoft.com/office/drawing/2016/5/14/chartex" xmlns:mc="http://schemas.openxmlformats.org/markup-compatibility/2006" xmlns:aink="http://schemas.microsoft.com/office/drawing/2016/ink" xmlns:am3d="http://schemas.microsoft.com/office/drawing/2017/model3d" xmlns:o="urn:schemas-microsoft-com:office:office" xmlns:oel="http://schemas.microsoft.com/office/2019/extlst" xmlns:r="http://schemas.openxmlformats.org/officeDocument/2006/relationships" xmlns:m="http://schemas.openxmlformats.org/officeDocument/2006/math" xmlns:v="urn:schemas-microsoft-com:vml" xmlns:wp14="http://schemas.microsoft.com/office/word/2010/wordprocessingDrawing" xmlns:wp="http://schemas.openxmlformats.org/drawingml/2006/wordprocessingDrawing" xmlns:w10="urn:schemas-microsoft-com:office:word" xmlns:w="http://schemas.openxmlformats.org/wordprocessingml/2006/main" xmlns:w14="http://schemas.microsoft.com/office/word/2010/wordml" xmlns:w15="http://schemas.microsoft.com/office/word/2012/wordml" xmlns:w16cex="http://schemas.microsoft.com/office/word/2018/wordml/cex" xmlns:w16cid="http://schemas.microsoft.com/office/word/2016/wordml/cid" xmlns:w16="http://schemas.microsoft.com/office/word/2018/wordml" xmlns:w16du="http://schemas.microsoft.com/office/word/2023/wordml/word16du" xmlns:w16sdtdh="http://schemas.microsoft.com/office/word/2020/wordml/sdtdatahash" xmlns:w16sdtfl="http://schemas.microsoft.com/office/word/2024/wordml/sdtformatlock" xmlns:w16se="http://schemas.microsoft.com/office/word/2015/wordml/symex" xmlns:wpg="http://schemas.microsoft.com/office/word/2010/wordprocessingGroup" xmlns:wpi="http://schemas.microsoft.com/office/word/2010/wordprocessingInk" xmlns:wne="http://schemas.microsoft.com/office/word/2006/wordml" xmlns:wps="http://schemas.microsoft.com/office/word/2010/wordprocessingShape" mc:Ignorable="w14 w15 w16se w16cid w16 w16cex w16sdtdh w16sdtfl w16du wp14">
   <w:p>
     <w:pPr>
       <w:pStyle w:val="Header"/>
@@ -11686,7 +11862,7 @@
 </file>
 
 <file path=word/header2.xml><?xml version="1.0" encoding="utf-8"?>
-<w:hdr xmlns:wpc="http://schemas.microsoft.com/office/word/2010/wordprocessingCanvas" xmlns:cx="http://schemas.microsoft.com/office/drawing/2014/chartex" xmlns:cx1="http://schemas.microsoft.com/office/drawing/2015/9/8/chartex" xmlns:cx2="http://schemas.microsoft.com/office/drawing/2015/10/21/chartex" xmlns:cx3="http://schemas.microsoft.com/office/drawing/2016/5/9/chartex" xmlns:cx4="http://schemas.microsoft.com/office/drawing/2016/5/10/chartex" xmlns:cx5="http://schemas.microsoft.com/office/drawing/2016/5/11/chartex" xmlns:cx6="http://schemas.microsoft.com/office/drawing/2016/5/12/chartex" xmlns:cx7="http://schemas.microsoft.com/office/drawing/2016/5/13/chartex" xmlns:cx8="http://schemas.microsoft.com/office/drawing/2016/5/14/chartex" xmlns:mc="http://schemas.openxmlformats.org/markup-compatibility/2006" xmlns:aink="http://schemas.microsoft.com/office/drawing/2016/ink" xmlns:am3d="http://schemas.microsoft.com/office/drawing/2017/model3d" xmlns:o="urn:schemas-microsoft-com:office:office" xmlns:oel="http://schemas.microsoft.com/office/2019/extlst" xmlns:r="http://schemas.openxmlformats.org/officeDocument/2006/relationships" xmlns:m="http://schemas.openxmlformats.org/officeDocument/2006/math" xmlns:v="urn:schemas-microsoft-com:vml" xmlns:wp14="http://schemas.microsoft.com/office/word/2010/wordprocessingDrawing" xmlns:wp="http://schemas.openxmlformats.org/drawingml/2006/wordprocessingDrawing" xmlns:w10="urn:schemas-microsoft-com:office:word" xmlns:w="http://schemas.openxmlformats.org/wordprocessingml/2006/main" xmlns:w14="http://schemas.microsoft.com/office/word/2010/wordml" xmlns:w15="http://schemas.microsoft.com/office/word/2012/wordml" xmlns:w16cei="http://schemas.microsoft.com/office/word/2026/wordml/cei" xmlns:w16cex="http://schemas.microsoft.com/office/word/2018/wordml/cex" xmlns:w16cid="http://schemas.microsoft.com/office/word/2016/wordml/cid" xmlns:w16="http://schemas.microsoft.com/office/word/2018/wordml" xmlns:w16du="http://schemas.microsoft.com/office/word/2023/wordml/word16du" xmlns:w16sdtdh="http://schemas.microsoft.com/office/word/2020/wordml/sdtdatahash" xmlns:w16sdtfl="http://schemas.microsoft.com/office/word/2024/wordml/sdtformatlock" xmlns:w16se="http://schemas.microsoft.com/office/word/2015/wordml/symex" xmlns:wpg="http://schemas.microsoft.com/office/word/2010/wordprocessingGroup" xmlns:wpi="http://schemas.microsoft.com/office/word/2010/wordprocessingInk" xmlns:wne="http://schemas.microsoft.com/office/word/2006/wordml" xmlns:wps="http://schemas.microsoft.com/office/word/2010/wordprocessingShape" mc:Ignorable="w14 w15 w16se w16cid w16 w16cex w16sdtdh w16sdtfl w16du wp14">
+<w:hdr xmlns:wpc="http://schemas.microsoft.com/office/word/2010/wordprocessingCanvas" xmlns:cx="http://schemas.microsoft.com/office/drawing/2014/chartex" xmlns:cx1="http://schemas.microsoft.com/office/drawing/2015/9/8/chartex" xmlns:cx2="http://schemas.microsoft.com/office/drawing/2015/10/21/chartex" xmlns:cx3="http://schemas.microsoft.com/office/drawing/2016/5/9/chartex" xmlns:cx4="http://schemas.microsoft.com/office/drawing/2016/5/10/chartex" xmlns:cx5="http://schemas.microsoft.com/office/drawing/2016/5/11/chartex" xmlns:cx6="http://schemas.microsoft.com/office/drawing/2016/5/12/chartex" xmlns:cx7="http://schemas.microsoft.com/office/drawing/2016/5/13/chartex" xmlns:cx8="http://schemas.microsoft.com/office/drawing/2016/5/14/chartex" xmlns:mc="http://schemas.openxmlformats.org/markup-compatibility/2006" xmlns:aink="http://schemas.microsoft.com/office/drawing/2016/ink" xmlns:am3d="http://schemas.microsoft.com/office/drawing/2017/model3d" xmlns:o="urn:schemas-microsoft-com:office:office" xmlns:oel="http://schemas.microsoft.com/office/2019/extlst" xmlns:r="http://schemas.openxmlformats.org/officeDocument/2006/relationships" xmlns:m="http://schemas.openxmlformats.org/officeDocument/2006/math" xmlns:v="urn:schemas-microsoft-com:vml" xmlns:wp14="http://schemas.microsoft.com/office/word/2010/wordprocessingDrawing" xmlns:wp="http://schemas.openxmlformats.org/drawingml/2006/wordprocessingDrawing" xmlns:w10="urn:schemas-microsoft-com:office:word" xmlns:w="http://schemas.openxmlformats.org/wordprocessingml/2006/main" xmlns:w14="http://schemas.microsoft.com/office/word/2010/wordml" xmlns:w15="http://schemas.microsoft.com/office/word/2012/wordml" xmlns:w16cex="http://schemas.microsoft.com/office/word/2018/wordml/cex" xmlns:w16cid="http://schemas.microsoft.com/office/word/2016/wordml/cid" xmlns:w16="http://schemas.microsoft.com/office/word/2018/wordml" xmlns:w16du="http://schemas.microsoft.com/office/word/2023/wordml/word16du" xmlns:w16sdtdh="http://schemas.microsoft.com/office/word/2020/wordml/sdtdatahash" xmlns:w16sdtfl="http://schemas.microsoft.com/office/word/2024/wordml/sdtformatlock" xmlns:w16se="http://schemas.microsoft.com/office/word/2015/wordml/symex" xmlns:wpg="http://schemas.microsoft.com/office/word/2010/wordprocessingGroup" xmlns:wpi="http://schemas.microsoft.com/office/word/2010/wordprocessingInk" xmlns:wne="http://schemas.microsoft.com/office/word/2006/wordml" xmlns:wps="http://schemas.microsoft.com/office/word/2010/wordprocessingShape" mc:Ignorable="w14 w15 w16se w16cid w16 w16cex w16sdtdh w16sdtfl w16du wp14">
   <w:p>
     <w:pPr>
       <w:pStyle w:val="Header"/>
@@ -11726,7 +11902,7 @@
 </file>
 
 <file path=word/numbering.xml><?xml version="1.0" encoding="utf-8"?>
-<w:numbering xmlns:wpc="http://schemas.microsoft.com/office/word/2010/wordprocessingCanvas" xmlns:cx="http://schemas.microsoft.com/office/drawing/2014/chartex" xmlns:cx1="http://schemas.microsoft.com/office/drawing/2015/9/8/chartex" xmlns:cx2="http://schemas.microsoft.com/office/drawing/2015/10/21/chartex" xmlns:cx3="http://schemas.microsoft.com/office/drawing/2016/5/9/chartex" xmlns:cx4="http://schemas.microsoft.com/office/drawing/2016/5/10/chartex" xmlns:cx5="http://schemas.microsoft.com/office/drawing/2016/5/11/chartex" xmlns:cx6="http://schemas.microsoft.com/office/drawing/2016/5/12/chartex" xmlns:cx7="http://schemas.microsoft.com/office/drawing/2016/5/13/chartex" xmlns:cx8="http://schemas.microsoft.com/office/drawing/2016/5/14/chartex" xmlns:mc="http://schemas.openxmlformats.org/markup-compatibility/2006" xmlns:aink="http://schemas.microsoft.com/office/drawing/2016/ink" xmlns:am3d="http://schemas.microsoft.com/office/drawing/2017/model3d" xmlns:o="urn:schemas-microsoft-com:office:office" xmlns:oel="http://schemas.microsoft.com/office/2019/extlst" xmlns:r="http://schemas.openxmlformats.org/officeDocument/2006/relationships" xmlns:m="http://schemas.openxmlformats.org/officeDocument/2006/math" xmlns:v="urn:schemas-microsoft-com:vml" xmlns:wp14="http://schemas.microsoft.com/office/word/2010/wordprocessingDrawing" xmlns:wp="http://schemas.openxmlformats.org/drawingml/2006/wordprocessingDrawing" xmlns:w10="urn:schemas-microsoft-com:office:word" xmlns:w="http://schemas.openxmlformats.org/wordprocessingml/2006/main" xmlns:w14="http://schemas.microsoft.com/office/word/2010/wordml" xmlns:w15="http://schemas.microsoft.com/office/word/2012/wordml" xmlns:w16cei="http://schemas.microsoft.com/office/word/2026/wordml/cei" xmlns:w16cex="http://schemas.microsoft.com/office/word/2018/wordml/cex" xmlns:w16cid="http://schemas.microsoft.com/office/word/2016/wordml/cid" xmlns:w16="http://schemas.microsoft.com/office/word/2018/wordml" xmlns:w16du="http://schemas.microsoft.com/office/word/2023/wordml/word16du" xmlns:w16sdtdh="http://schemas.microsoft.com/office/word/2020/wordml/sdtdatahash" xmlns:w16sdtfl="http://schemas.microsoft.com/office/word/2024/wordml/sdtformatlock" xmlns:w16se="http://schemas.microsoft.com/office/word/2015/wordml/symex" xmlns:wpg="http://schemas.microsoft.com/office/word/2010/wordprocessingGroup" xmlns:wpi="http://schemas.microsoft.com/office/word/2010/wordprocessingInk" xmlns:wne="http://schemas.microsoft.com/office/word/2006/wordml" xmlns:wps="http://schemas.microsoft.com/office/word/2010/wordprocessingShape" mc:Ignorable="w14 w15 w16se w16cid w16 w16cex w16sdtdh w16sdtfl w16du wp14">
+<w:numbering xmlns:wpc="http://schemas.microsoft.com/office/word/2010/wordprocessingCanvas" xmlns:cx="http://schemas.microsoft.com/office/drawing/2014/chartex" xmlns:cx1="http://schemas.microsoft.com/office/drawing/2015/9/8/chartex" xmlns:cx2="http://schemas.microsoft.com/office/drawing/2015/10/21/chartex" xmlns:cx3="http://schemas.microsoft.com/office/drawing/2016/5/9/chartex" xmlns:cx4="http://schemas.microsoft.com/office/drawing/2016/5/10/chartex" xmlns:cx5="http://schemas.microsoft.com/office/drawing/2016/5/11/chartex" xmlns:cx6="http://schemas.microsoft.com/office/drawing/2016/5/12/chartex" xmlns:cx7="http://schemas.microsoft.com/office/drawing/2016/5/13/chartex" xmlns:cx8="http://schemas.microsoft.com/office/drawing/2016/5/14/chartex" xmlns:mc="http://schemas.openxmlformats.org/markup-compatibility/2006" xmlns:aink="http://schemas.microsoft.com/office/drawing/2016/ink" xmlns:am3d="http://schemas.microsoft.com/office/drawing/2017/model3d" xmlns:o="urn:schemas-microsoft-com:office:office" xmlns:oel="http://schemas.microsoft.com/office/2019/extlst" xmlns:r="http://schemas.openxmlformats.org/officeDocument/2006/relationships" xmlns:m="http://schemas.openxmlformats.org/officeDocument/2006/math" xmlns:v="urn:schemas-microsoft-com:vml" xmlns:wp14="http://schemas.microsoft.com/office/word/2010/wordprocessingDrawing" xmlns:wp="http://schemas.openxmlformats.org/drawingml/2006/wordprocessingDrawing" xmlns:w10="urn:schemas-microsoft-com:office:word" xmlns:w="http://schemas.openxmlformats.org/wordprocessingml/2006/main" xmlns:w14="http://schemas.microsoft.com/office/word/2010/wordml" xmlns:w15="http://schemas.microsoft.com/office/word/2012/wordml" xmlns:w16cex="http://schemas.microsoft.com/office/word/2018/wordml/cex" xmlns:w16cid="http://schemas.microsoft.com/office/word/2016/wordml/cid" xmlns:w16="http://schemas.microsoft.com/office/word/2018/wordml" xmlns:w16du="http://schemas.microsoft.com/office/word/2023/wordml/word16du" xmlns:w16sdtdh="http://schemas.microsoft.com/office/word/2020/wordml/sdtdatahash" xmlns:w16sdtfl="http://schemas.microsoft.com/office/word/2024/wordml/sdtformatlock" xmlns:w16se="http://schemas.microsoft.com/office/word/2015/wordml/symex" xmlns:wpg="http://schemas.microsoft.com/office/word/2010/wordprocessingGroup" xmlns:wpi="http://schemas.microsoft.com/office/word/2010/wordprocessingInk" xmlns:wne="http://schemas.microsoft.com/office/word/2006/wordml" xmlns:wps="http://schemas.microsoft.com/office/word/2010/wordprocessingShape" mc:Ignorable="w14 w15 w16se w16cid w16 w16cex w16sdtdh w16sdtfl w16du wp14">
   <w:abstractNum w:abstractNumId="0" w15:restartNumberingAfterBreak="0">
     <w:nsid w:val="00527BA3"/>
     <w:multiLevelType w:val="hybridMultilevel"/>

</xml_diff>